<commit_message>
Clarify WCL calibration wording and inherited bootstrap metadata
</commit_message>
<xml_diff>
--- a/paper/manuscripts/nestcom_wcl_adatoken_20261027_v2/manuscript_review.docx
+++ b/paper/manuscripts/nestcom_wcl_adatoken_20261027_v2/manuscript_review.docx
@@ -1086,7 +1086,7 @@
               <a:graphicData uri="http://schemas.openxmlformats.org/drawingml/2006/picture">
                 <pic:pic>
                   <pic:nvPicPr>
-                    <pic:cNvPr descr="C:/Users/11946/Documents/ChatGPT/comm/.research/wcl_revision_tasks_20261027_v1/word_work/figure1.png" id="15" name="Picture"/>
+                    <pic:cNvPr descr="C:/Users/11946/Documents/ChatGPT/comm/.research/wcl_editorial_20261027_v1/word_work/figure1.png" id="15" name="Picture"/>
                     <pic:cNvPicPr>
                       <a:picLocks noChangeArrowheads="1" noChangeAspect="1"/>
                     </pic:cNvPicPr>
@@ -2162,7 +2162,7 @@
         <w:widowControl/>
       </w:pPr>
       <w:r>
-        <w:t xml:space="preserve">The initial target search uses</w:t>
+        <w:t xml:space="preserve">The target search first considers</w:t>
       </w:r>
       <w:r>
         <w:t xml:space="preserve"> </w:t>
@@ -2386,27 +2386,42 @@
         </m:r>
       </m:oMath>
       <w:r>
-        <w:t xml:space="preserve">. A 100-image pilot shortlists candidates; its top three and the complete-scale anchor are reevaluated on all 1000 calibration images. The subsequent full-</w:t>
+        <w:t xml:space="preserve">. A 100-image pilot evaluates each candidate using one channel realization per image and shortlists its top three candidates plus the complete-scale anchor. Final evaluation compares these finalists and the full-scale</w:t>
+      </w:r>
+      <w:r>
+        <w:t xml:space="preserve"> </w:t>
       </w:r>
       <m:oMath>
-        <m:r>
-          <m:t>m</m:t>
-        </m:r>
         <m:r>
           <m:rPr>
             <m:sty m:val="p"/>
           </m:rPr>
-          <m:t>=</m:t>
+          <m:t>(</m:t>
         </m:r>
         <m:r>
           <m:t>10</m:t>
         </m:r>
+        <m:r>
+          <m:rPr>
+            <m:sty m:val="p"/>
+          </m:rPr>
+          <m:t>,</m:t>
+        </m:r>
+        <m:r>
+          <m:t>0</m:t>
+        </m:r>
+        <m:r>
+          <m:rPr>
+            <m:sty m:val="p"/>
+          </m:rPr>
+          <m:t>)</m:t>
+        </m:r>
       </m:oMath>
       <w:r>
         <w:t xml:space="preserve"> </w:t>
       </w:r>
       <w:r>
-        <w:t xml:space="preserve">revision retains these finalists and evaluates the distinct new full-scale policies after exact-stream reuse. Selection maximizes source/reconstruction DINOv2 cosine [10]: average three actual channel outcomes per image, including rejected gray outputs, then average sources. Exact ties prefer legacy candidates, then lexical candidate ID. This is a staged search, not exhaustive full-population optimization.</w:t>
+        <w:t xml:space="preserve">candidates on all 1000 calibration images with three channel realizations per image, including the fixed gray outputs of rejected transmissions. Selection maximizes source/reconstruction DINOv2 cosine [10], first averaged over the three realizations of each image and then equally over sources. Exact ties follow a fixed candidate order documented in the configuration.</w:t>
       </w:r>
     </w:p>
     <w:p>
@@ -2807,7 +2822,7 @@
         </m:r>
       </m:oMath>
       <w:r>
-        <w:t xml:space="preserve">. WHOLE uses complete scales; PARTIAL also uses the quarter endpoints above. Counts are distinct, so no endpoint-order tie occurs. With fixed MCS, TX sends the first independently terminated stream satisfying (4); its paid profile identifies the actual endpoint. No feasible endpoint triggers an execution error in this implementation, not a defined null transmission; all evaluated sources fit. A slice of a longer arithmetic stream is never used.</w:t>
+        <w:t xml:space="preserve">. WHOLE uses complete scales; PARTIAL also uses the quarter endpoints above. Counts are distinct, so no endpoint-order tie occurs. With fixed MCS, TX sends the first independently terminated stream satisfying (4); its paid profile identifies the actual endpoint. If no endpoint satisfies the budget, the implementation raises an error; this case did not occur for any evaluated source. A slice of a longer arithmetic stream is never used.</w:t>
       </w:r>
     </w:p>
     <w:p>
@@ -3281,7 +3296,7 @@
               <a:graphicData uri="http://schemas.openxmlformats.org/drawingml/2006/picture">
                 <pic:pic>
                   <pic:nvPicPr>
-                    <pic:cNvPr descr="C:/Users/11946/Documents/ChatGPT/comm/.research/wcl_revision_tasks_20261027_v1/word_work/figure2.png" id="22" name="Picture"/>
+                    <pic:cNvPr descr="C:/Users/11946/Documents/ChatGPT/comm/.research/wcl_editorial_20261027_v1/word_work/figure2.png" id="22" name="Picture"/>
                     <pic:cNvPicPr>
                       <a:picLocks noChangeArrowheads="1" noChangeAspect="1"/>
                     </pic:cNvPicPr>
@@ -3547,7 +3562,7 @@
         <w:t xml:space="preserve"> </w:t>
       </w:r>
       <w:r>
-        <w:t xml:space="preserve">preprocessing. We average three channel realizations per source, retaining gray failures, then compute equal-source means. Intervals are 95% source-bootstrap CIs; differences are directly source-paired. Pairing does not require identical noise realizations across methods. Generative seeds and decoding settings are fixed. Final source-parser/output audits find 0/1500 rejected or failed reconstructions per method and SNR on common500; continuous Latent JSCC has no discrete CRC rejection rule. Transmitter fallback is counted separately.</w:t>
+        <w:t xml:space="preserve">preprocessing. We average three channel realizations per source, retaining gray failures, then compute equal-source means. Intervals are 95% source-bootstrap CIs; differences are directly source-paired. Pairing does not require identical noise realizations across methods. Generative seeds and decoding settings are fixed. No rejected or failed reconstructions occurred in the 1500 trials per method at each matched SNR on common500. Continuous Latent JSCC has no discrete CRC rejection rule. Transmitter fallback is counted separately.</w:t>
       </w:r>
     </w:p>
     <w:bookmarkStart w:id="28" w:name="_522ab4a16efba62d5cc1ac1d670dda5233f558f"/>
@@ -3567,7 +3582,7 @@
               <a:graphicData uri="http://schemas.openxmlformats.org/drawingml/2006/picture">
                 <pic:pic>
                   <pic:nvPicPr>
-                    <pic:cNvPr descr="C:/Users/11946/Documents/ChatGPT/comm/.research/wcl_revision_tasks_20261027_v1/word_work/figure3.png" id="27" name="Picture"/>
+                    <pic:cNvPr descr="C:/Users/11946/Documents/ChatGPT/comm/.research/wcl_editorial_20261027_v1/word_work/figure3.png" id="27" name="Picture"/>
                     <pic:cNvPicPr>
                       <a:picLocks noChangeArrowheads="1" noChangeAspect="1"/>
                     </pic:cNvPicPr>
@@ -5163,7 +5178,7 @@
         <w:widowControl/>
       </w:pPr>
       <w:r>
-        <w:t xml:space="preserve">A receiver intervention uses the same 100 sources and actual received prefixes, without new endpoint selection or channel trials. A0 ignores received boundary positions and follows the prior path. B0 adds their correction only to the final residual latent, leaving finer-scale context on the A0 path. C0 updates both latent and context. All three use the same registered device and precision. At 10 dB, B0</w:t>
+        <w:t xml:space="preserve">A receiver intervention uses the same 100 sources and actual received prefixes, without new endpoint selection or channel trials. A0 ignores received boundary positions and follows the prior path. B0 adds their correction only to the final residual latent, leaving finer-scale context on the A0 path. C0 updates both latent and context. All three use the same device and numerical precision. At 10 dB, B0</w:t>
       </w:r>
       <m:oMath>
         <m:r>
@@ -5196,7 +5211,7 @@
         </m:r>
       </m:oMath>
       <w:r>
-        <w:t xml:space="preserve">B0 is zero at 19 dB because the boundary is the last scale. These are ordered empirical contrasts, not independently additive gains for arbitrary systems.</w:t>
+        <w:t xml:space="preserve">B0 is zero at 19 dB because the boundary is the last scale.</w:t>
       </w:r>
     </w:p>
     <w:p>
@@ -6012,18 +6027,12 @@
         <w:widowControl/>
       </w:pPr>
       <w:r>
-        <w:t xml:space="preserve">A TX-policy SNR mismatch diagnostic fixes both 10 dB policies on the existing 100-source subset, sharing three AWGN vectors per source across WHOLE/PARTIAL and scaling them to true SNRs of 8/10/12 dB. RX retains the true noise variance. At 8 dB, both reject 300/300 receptions and output gray images (mean PSNR 11.455 dB, DreamSim 0.9408). At 10 and 12 dB, each accepts 300/300, with identical received prefixes and reconstructions. PARTIAL minus WHOLE is</w:t>
+        <w:t xml:space="preserve">A TX-policy SNR mismatch diagnostic shares three AWGN vectors per source across WHOLE/PARTIAL and scales them to 8/10/12 dB. With both transmit policies fixed at 10 dB and RX using the true noise variance, all 300 receptions per method were rejected at 8 dB, whereas all succeeded at 10 and 12 dB on the existing 100-image subset. For each image and method, the recovered prefix and reconstruction were identical at 10 and 12 dB. PARTIAL exceeded WHOLE by</w:t>
       </w:r>
       <w:r>
         <w:t xml:space="preserve"> </w:t>
       </w:r>
       <m:oMath>
-        <m:r>
-          <m:rPr>
-            <m:sty m:val="p"/>
-          </m:rPr>
-          <m:t>+</m:t>
-        </m:r>
         <m:r>
           <m:t>0.660</m:t>
         </m:r>
@@ -6056,7 +6065,7 @@
         </m:r>
       </m:oMath>
       <w:r>
-        <w:t xml:space="preserve"> dB in PSNR and</w:t>
+        <w:t xml:space="preserve"> dB in PSNR at both points, with a DreamSim difference of</w:t>
       </w:r>
       <w:r>
         <w:t xml:space="preserve"> </w:t>
@@ -6112,10 +6121,7 @@
         </m:r>
       </m:oMath>
       <w:r>
-        <w:t xml:space="preserve"> </w:t>
-      </w:r>
-      <w:r>
-        <w:t xml:space="preserve">in DreamSim at both points; LPIPS and CLIP-I also improve. All 1800 outcomes, including failures, enter source-level statistics. This frozen-policy test identifies a downward operating boundary; it does not change Table I(B)’s controlled-granularity evidence.</w:t>
+        <w:t xml:space="preserve">. All 1800 outcomes, including gray failures, enter source-level statistics; the complete four-metric results are available in the repository.</w:t>
       </w:r>
     </w:p>
     <w:p>
@@ -6145,7 +6151,7 @@
         <w:widowControl/>
       </w:pPr>
       <w:r>
-        <w:t xml:space="preserve">NeST-Com connects within-scale endpoints, terminated-length fitting, and prefix-constrained reconstruction under a fixed symbol budget. Shared-model evaluations show improved capacity utilization and reconstruction quality, while controlled grids reveal further gains from denser endpoints. Six-system results expose pixel–perceptual tradeoffs, including operating points favoring adapted Ada. A frozen-policy mismatch diagnostic exposes a sharp rejection boundary below its design SNR. Alternative calibration objectives remain future work.</w:t>
+        <w:t xml:space="preserve">NeST-Com connects within-scale endpoints, terminated-length fitting, and prefix-constrained reconstruction under a fixed symbol budget. Shared-model evaluations show improved capacity utilization and reconstruction quality, while controlled grids reveal further gains from denser endpoints. Six-system results expose pixel–perceptual tradeoffs, including operating points favoring adapted Ada. Alternative calibration objectives remain future work.</w:t>
       </w:r>
     </w:p>
     <w:p>

</xml_diff>